<commit_message>
Added - Began work on DM Guide
French translation probably only coming after DM guide actually :P
</commit_message>
<xml_diff>
--- a/rulebooks/one_d&d_karak_en.docx
+++ b/rulebooks/one_d&d_karak_en.docx
@@ -70,7 +70,25 @@
                               <w:rPr>
                                 <w:lang w:val="fr-FR"/>
                               </w:rPr>
-                              <w:t>A module by L_PT</w:t>
+                              <w:t>A module by L_P</w:t>
+                            </w:r>
+                            <w:r>
+                              <w:rPr>
+                                <w:lang w:val="fr-FR"/>
+                              </w:rPr>
+                              <w:t>’</w:t>
+                            </w:r>
+                            <w:r>
+                              <w:rPr>
+                                <w:lang w:val="fr-FR"/>
+                              </w:rPr>
+                              <w:t>T</w:t>
+                            </w:r>
+                            <w:r>
+                              <w:rPr>
+                                <w:lang w:val="fr-FR"/>
+                              </w:rPr>
+                              <w:t>ato</w:t>
                             </w:r>
                           </w:p>
                           <w:p>
@@ -101,15 +119,7 @@
                               <w:t xml:space="preserve"> by </w:t>
                             </w:r>
                             <w:r>
-                              <w:t xml:space="preserve">Petr </w:t>
-                            </w:r>
-                            <w:proofErr w:type="spellStart"/>
-                            <w:r>
-                              <w:t>Mikša</w:t>
-                            </w:r>
-                            <w:proofErr w:type="spellEnd"/>
-                            <w:r>
-                              <w:t xml:space="preserve"> &amp; Roman Hladík</w:t>
+                              <w:t>Petr Mikša &amp; Roman Hladík</w:t>
                             </w:r>
                           </w:p>
                         </w:txbxContent>
@@ -152,7 +162,25 @@
                         <w:rPr>
                           <w:lang w:val="fr-FR"/>
                         </w:rPr>
-                        <w:t>A module by L_PT</w:t>
+                        <w:t>A module by L_P</w:t>
+                      </w:r>
+                      <w:r>
+                        <w:rPr>
+                          <w:lang w:val="fr-FR"/>
+                        </w:rPr>
+                        <w:t>’</w:t>
+                      </w:r>
+                      <w:r>
+                        <w:rPr>
+                          <w:lang w:val="fr-FR"/>
+                        </w:rPr>
+                        <w:t>T</w:t>
+                      </w:r>
+                      <w:r>
+                        <w:rPr>
+                          <w:lang w:val="fr-FR"/>
+                        </w:rPr>
+                        <w:t>ato</w:t>
                       </w:r>
                     </w:p>
                     <w:p>
@@ -183,15 +211,7 @@
                         <w:t xml:space="preserve"> by </w:t>
                       </w:r>
                       <w:r>
-                        <w:t xml:space="preserve">Petr </w:t>
-                      </w:r>
-                      <w:proofErr w:type="spellStart"/>
-                      <w:r>
-                        <w:t>Mikša</w:t>
-                      </w:r>
-                      <w:proofErr w:type="spellEnd"/>
-                      <w:r>
-                        <w:t xml:space="preserve"> &amp; Roman Hladík</w:t>
+                        <w:t>Petr Mikša &amp; Roman Hladík</w:t>
                       </w:r>
                     </w:p>
                   </w:txbxContent>
@@ -3469,19 +3489,40 @@
     </w:p>
     <w:p>
       <w:r>
+        <w:t xml:space="preserve">The game is played between 3 to 6 people. Up to five of them act as players, taking control of a Hero. The last person takes the role of the Dungeon Master: the master of the games who controls all the Monsters. He also acts as a mediator. It is recommended for the DM to check out the </w:t>
+      </w:r>
+      <w:r>
+        <w:rPr>
+          <w:i/>
+          <w:iCs/>
+        </w:rPr>
+        <w:t>One D&amp;D Dungeon Master Guide</w:t>
+      </w:r>
+      <w:r>
+        <w:t>.</w:t>
+      </w:r>
+    </w:p>
+    <w:p>
+      <w:r>
         <w:t xml:space="preserve">The </w:t>
       </w:r>
       <w:r>
         <w:t>p</w:t>
       </w:r>
       <w:r>
-        <w:t xml:space="preserve">layer who has collected the most treasure becomes the victor. The game ends once any </w:t>
+        <w:t xml:space="preserve">layer who has collected the most treasure </w:t>
+      </w:r>
+      <w:r>
+        <w:t xml:space="preserve">at the end of the game </w:t>
+      </w:r>
+      <w:r>
+        <w:t xml:space="preserve">becomes the victor. The game ends once any </w:t>
       </w:r>
       <w:r>
         <w:t>p</w:t>
       </w:r>
       <w:r>
-        <w:t xml:space="preserve">layer defeats the strongest monster of the game - THE DRAGON - and loots its treasure with a ruby. Each </w:t>
+        <w:t xml:space="preserve">layer defeats the strongest monster - THE DRAGON - and loots its treasure with a ruby. Each </w:t>
       </w:r>
       <w:r>
         <w:t>p</w:t>
@@ -4620,13 +4661,7 @@
         <w:pStyle w:val="Paragraphedeliste"/>
       </w:pPr>
       <w:r>
-        <w:t xml:space="preserve">On a success, the attacker rolls damage as described by the attack. At this point, they may also add their Damage Modifier or their Wisdom score to </w:t>
-      </w:r>
-      <w:r>
-        <w:t xml:space="preserve">the damage </w:t>
-      </w:r>
-      <w:r>
-        <w:t>dice, depending on the attack’s description, to define the total amount of the damage delt to the defender.</w:t>
+        <w:t>On a success, the attacker rolls damage as described by the attack. At this point, they may also add their Damage Modifier or their Wisdom score to the damage dice, depending on the attack’s description, to define the total amount of the damage delt to the defender.</w:t>
       </w:r>
     </w:p>
     <w:p>
@@ -5267,10 +5302,7 @@
         <w:t>m</w:t>
       </w:r>
       <w:r>
-        <w:t>aximum HP</w:t>
-      </w:r>
-      <w:r>
-        <w:t xml:space="preserve"> </w:t>
+        <w:t xml:space="preserve">aximum HP </w:t>
       </w:r>
     </w:p>
     <w:p>
@@ -9733,13 +9765,7 @@
     </w:p>
     <w:p>
       <w:r>
-        <w:t xml:space="preserve">Upon being consumed, the </w:t>
-      </w:r>
-      <w:r>
-        <w:t>Healing</w:t>
-      </w:r>
-      <w:r>
-        <w:t xml:space="preserve"> Scroll must be discarded. </w:t>
+        <w:t xml:space="preserve">Upon being consumed, the Healing Scroll must be discarded. </w:t>
       </w:r>
       <w:r>
         <w:rPr>
@@ -10408,10 +10434,7 @@
           </w:tcPr>
           <w:p>
             <w:r>
-              <w:t>The Skeleton Turnkey attempts to flee combat</w:t>
-            </w:r>
-            <w:r>
-              <w:t>, exiting to a neighbouring tile without a Hero.</w:t>
+              <w:t>The Skeleton Turnkey attempts to flee combat, exiting to a neighbouring tile without a Hero.</w:t>
             </w:r>
           </w:p>
           <w:p>
@@ -13609,10 +13632,7 @@
               <w:jc w:val="center"/>
             </w:pPr>
             <w:r>
-              <w:t>3</w:t>
-            </w:r>
-            <w:r>
-              <w:t>5</w:t>
+              <w:t>35</w:t>
             </w:r>
           </w:p>
         </w:tc>
@@ -14445,11 +14465,9 @@
             <w:pPr>
               <w:jc w:val="center"/>
             </w:pPr>
-            <w:proofErr w:type="spellStart"/>
             <w:r>
               <w:t>Battelaxe</w:t>
             </w:r>
-            <w:proofErr w:type="spellEnd"/>
           </w:p>
         </w:tc>
         <w:tc>
@@ -14560,16 +14578,7 @@
               <w:t xml:space="preserve">made against him </w:t>
             </w:r>
             <w:r>
-              <w:t xml:space="preserve">and </w:t>
-            </w:r>
-            <w:r>
-              <w:t>reflects that damage</w:t>
-            </w:r>
-            <w:r>
-              <w:t xml:space="preserve"> back to the attacker</w:t>
-            </w:r>
-            <w:r>
-              <w:t xml:space="preserve"> as Fire damage.</w:t>
+              <w:t>and reflects that damage back to the attacker as Fire damage.</w:t>
             </w:r>
           </w:p>
         </w:tc>
@@ -14731,10 +14740,7 @@
               <w:jc w:val="center"/>
             </w:pPr>
             <w:r>
-              <w:t>3</w:t>
-            </w:r>
-            <w:r>
-              <w:t>0</w:t>
+              <w:t>30</w:t>
             </w:r>
           </w:p>
         </w:tc>
@@ -15744,12 +15750,10 @@
         </w:rPr>
       </w:pPr>
       <w:bookmarkStart w:id="29" w:name="_Toc242108211"/>
-      <w:proofErr w:type="spellStart"/>
       <w:r>
         <w:lastRenderedPageBreak/>
         <w:t>Argentus</w:t>
       </w:r>
-      <w:proofErr w:type="spellEnd"/>
       <w:r>
         <w:t xml:space="preserve">, </w:t>
       </w:r>
@@ -15956,10 +15960,7 @@
               <w:jc w:val="center"/>
             </w:pPr>
             <w:r>
-              <w:t>1</w:t>
-            </w:r>
-            <w:r>
-              <w:t>1</w:t>
+              <w:t>11</w:t>
             </w:r>
           </w:p>
         </w:tc>
@@ -16407,15 +16408,7 @@
           </w:tcPr>
           <w:p>
             <w:r>
-              <w:t xml:space="preserve">When taking a Short Rest, </w:t>
-            </w:r>
-            <w:proofErr w:type="spellStart"/>
-            <w:r>
-              <w:t>Argentus</w:t>
-            </w:r>
-            <w:proofErr w:type="spellEnd"/>
-            <w:r>
-              <w:t xml:space="preserve"> regains </w:t>
+              <w:t xml:space="preserve">When taking a Short Rest, Argentus regains </w:t>
             </w:r>
             <w:r>
               <w:t>1</w:t>
@@ -16547,13 +16540,8 @@
             <w:vAlign w:val="center"/>
           </w:tcPr>
           <w:p>
-            <w:proofErr w:type="spellStart"/>
-            <w:r>
-              <w:t>Agrentus</w:t>
-            </w:r>
-            <w:proofErr w:type="spellEnd"/>
-            <w:r>
-              <w:t xml:space="preserve"> does not consume the Flame Scroll when using it.</w:t>
+            <w:r>
+              <w:t>Agrentus does not consume the Flame Scroll when using it.</w:t>
             </w:r>
           </w:p>
         </w:tc>
@@ -16680,16 +16668,8 @@
             <w:vAlign w:val="center"/>
           </w:tcPr>
           <w:p>
-            <w:proofErr w:type="spellStart"/>
-            <w:r>
-              <w:t>Argentus</w:t>
-            </w:r>
-            <w:proofErr w:type="spellEnd"/>
-            <w:r>
-              <w:t xml:space="preserve"> can move through walls</w:t>
-            </w:r>
-            <w:r>
-              <w:t>, but only into tiles that have already been discovered.</w:t>
+            <w:r>
+              <w:t>Argentus can move through walls, but only into tiles that have already been discovered.</w:t>
             </w:r>
           </w:p>
         </w:tc>
@@ -16830,21 +16810,17 @@
             <w:vAlign w:val="center"/>
           </w:tcPr>
           <w:p>
-            <w:proofErr w:type="spellStart"/>
             <w:r>
               <w:t>Argentus</w:t>
             </w:r>
-            <w:proofErr w:type="spellEnd"/>
             <w:r>
               <w:t xml:space="preserve"> can cast a single spell in its turn instead of using the Base Attack.</w:t>
             </w:r>
           </w:p>
           <w:p>
-            <w:proofErr w:type="spellStart"/>
             <w:r>
               <w:t>Argentus</w:t>
             </w:r>
-            <w:proofErr w:type="spellEnd"/>
             <w:r>
               <w:t xml:space="preserve"> can cast Cantrips without limit, but only has two Spell Slots for Levelled Spells. </w:t>
             </w:r>
@@ -17229,24 +17205,7 @@
           </w:p>
           <w:p>
             <w:r>
-              <w:t>Combat automatically ends, and the tile acts as if it were empty.</w:t>
-            </w:r>
-            <w:r>
-              <w:t xml:space="preserve"> </w:t>
-            </w:r>
-            <w:r>
-              <w:t xml:space="preserve">The target wakes up on </w:t>
-            </w:r>
-            <w:proofErr w:type="spellStart"/>
-            <w:r>
-              <w:t>Argentus</w:t>
-            </w:r>
-            <w:proofErr w:type="spellEnd"/>
-            <w:r>
-              <w:t>’ next turn</w:t>
-            </w:r>
-            <w:r>
-              <w:t>, or if another player initiates combat with it.</w:t>
+              <w:t>Combat automatically ends, and the tile acts as if it were empty. The target wakes up on Argentus’ next turn, or if another player initiates combat with it.</w:t>
             </w:r>
           </w:p>
         </w:tc>
@@ -17984,24 +17943,10 @@
           </w:tcPr>
           <w:p>
             <w:r>
-              <w:t xml:space="preserve">Once per </w:t>
-            </w:r>
-            <w:r>
-              <w:t>turn</w:t>
-            </w:r>
-            <w:r>
-              <w:t xml:space="preserve">, </w:t>
-            </w:r>
-            <w:r>
-              <w:t xml:space="preserve">Lord </w:t>
-            </w:r>
-            <w:proofErr w:type="spellStart"/>
-            <w:r>
-              <w:t>Xanrus</w:t>
-            </w:r>
-            <w:proofErr w:type="spellEnd"/>
-            <w:r>
-              <w:t xml:space="preserve"> can sacrifice 6 hp to add 1d12 to the damage of </w:t>
+              <w:t xml:space="preserve">Once per turn, </w:t>
+            </w:r>
+            <w:r>
+              <w:t xml:space="preserve">Lord Xanrus can sacrifice 6 hp to add 1d12 to the damage of </w:t>
             </w:r>
             <w:r>
               <w:t>any successful</w:t>
@@ -18286,15 +18231,7 @@
               <w:t xml:space="preserve">, </w:t>
             </w:r>
             <w:r>
-              <w:t xml:space="preserve">Lord </w:t>
-            </w:r>
-            <w:proofErr w:type="spellStart"/>
-            <w:r>
-              <w:t>Xanrus</w:t>
-            </w:r>
-            <w:proofErr w:type="spellEnd"/>
-            <w:r>
-              <w:t xml:space="preserve"> can swap his position with any other hero.</w:t>
+              <w:t>Lord Xanrus can swap his position with any other hero.</w:t>
             </w:r>
             <w:r>
               <w:t xml:space="preserve"> This does not trigger an attack of opportunity if in combat.</w:t>
@@ -18308,15 +18245,7 @@
               <w:t xml:space="preserve">that </w:t>
             </w:r>
             <w:r>
-              <w:t xml:space="preserve">combat or not and vice-versa for the swapped player if Lord </w:t>
-            </w:r>
-            <w:proofErr w:type="spellStart"/>
-            <w:r>
-              <w:t>Xanrus</w:t>
-            </w:r>
-            <w:proofErr w:type="spellEnd"/>
-            <w:r>
-              <w:t xml:space="preserve"> was in combat.</w:t>
+              <w:t>combat or not and vice-versa for the swapped player if Lord Xanrus was in combat.</w:t>
             </w:r>
           </w:p>
         </w:tc>
@@ -18508,34 +18437,12 @@
           </w:tcPr>
           <w:p>
             <w:r>
-              <w:t xml:space="preserve">Lord </w:t>
-            </w:r>
-            <w:proofErr w:type="spellStart"/>
-            <w:r>
-              <w:t>Xanrus</w:t>
-            </w:r>
-            <w:proofErr w:type="spellEnd"/>
-            <w:r>
-              <w:t xml:space="preserve"> can cast a single spell in its turn instead of using the Base Attack.</w:t>
-            </w:r>
-          </w:p>
-          <w:p>
-            <w:r>
-              <w:t xml:space="preserve">Lord </w:t>
-            </w:r>
-            <w:proofErr w:type="spellStart"/>
-            <w:r>
-              <w:t>Xanrus</w:t>
-            </w:r>
-            <w:proofErr w:type="spellEnd"/>
-            <w:r>
-              <w:t xml:space="preserve"> can cast Cantrips without limit, but only has two Spell Slots for Levelled Spells. </w:t>
-            </w:r>
-            <w:r>
-              <w:t>He</w:t>
-            </w:r>
-            <w:r>
-              <w:t xml:space="preserve"> can use both Slots in a single turn to </w:t>
+              <w:t>Lord Xanrus can cast a single spell in its turn instead of using the Base Attack.</w:t>
+            </w:r>
+          </w:p>
+          <w:p>
+            <w:r>
+              <w:t xml:space="preserve">Lord Xanrus can cast Cantrips without limit, but only has two Spell Slots for Levelled Spells. He can use both Slots in a single turn to </w:t>
             </w:r>
             <w:r>
               <w:rPr>
@@ -18611,13 +18518,7 @@
               <w:t>1</w:t>
             </w:r>
             <w:r>
-              <w:t xml:space="preserve"> target: 1d</w:t>
-            </w:r>
-            <w:r>
-              <w:t>8</w:t>
-            </w:r>
-            <w:r>
-              <w:t xml:space="preserve"> + </w:t>
+              <w:t xml:space="preserve"> target: 1d8 + </w:t>
             </w:r>
             <w:r>
               <w:rPr>
@@ -18632,10 +18533,7 @@
               <w:t xml:space="preserve"> </w:t>
             </w:r>
             <w:r>
-              <w:t>Physical damage.</w:t>
-            </w:r>
-            <w:r>
-              <w:t xml:space="preserve"> This trigger’s Lord Xanrus’ Attack Skill.</w:t>
+              <w:t>Physical damage. This trigger’s Lord Xanrus’ Attack Skill.</w:t>
             </w:r>
           </w:p>
         </w:tc>
@@ -18694,15 +18592,7 @@
           </w:tcPr>
           <w:p>
             <w:r>
-              <w:t xml:space="preserve">Lord </w:t>
-            </w:r>
-            <w:proofErr w:type="spellStart"/>
-            <w:r>
-              <w:t>Xanrus</w:t>
-            </w:r>
-            <w:proofErr w:type="spellEnd"/>
-            <w:r>
-              <w:t xml:space="preserve"> gains resistance against Physical damage until his next turn.</w:t>
+              <w:t>Lord Xanrus gains resistance against Physical damage until his next turn.</w:t>
             </w:r>
           </w:p>
         </w:tc>
@@ -18771,15 +18661,7 @@
           </w:p>
           <w:p>
             <w:r>
-              <w:t xml:space="preserve">The attack automatically hits but Lord </w:t>
-            </w:r>
-            <w:proofErr w:type="spellStart"/>
-            <w:r>
-              <w:t>Xanrus</w:t>
-            </w:r>
-            <w:proofErr w:type="spellEnd"/>
-            <w:r>
-              <w:t xml:space="preserve"> may not flee until the end of combat. This includes using his Movement Skill.</w:t>
+              <w:t>The attack automatically hits but Lord Xanrus may not flee until the end of combat. This includes using his Movement Skill.</w:t>
             </w:r>
           </w:p>
         </w:tc>
@@ -18906,15 +18788,7 @@
           </w:tcPr>
           <w:p>
             <w:r>
-              <w:t xml:space="preserve">Lord </w:t>
-            </w:r>
-            <w:proofErr w:type="spellStart"/>
-            <w:r>
-              <w:t>Xanrus</w:t>
-            </w:r>
-            <w:proofErr w:type="spellEnd"/>
-            <w:r>
-              <w:t xml:space="preserve"> gains 8 Temporary HP, which and cannot be healed.</w:t>
+              <w:t>Lord Xanrus gains 8 Temporary HP, which and cannot be healed.</w:t>
             </w:r>
           </w:p>
           <w:p>
@@ -18987,18 +18861,7 @@
               <w:t>Up-cast:</w:t>
             </w:r>
             <w:r>
-              <w:t xml:space="preserve"> </w:t>
-            </w:r>
-            <w:r>
-              <w:t xml:space="preserve">Lord </w:t>
-            </w:r>
-            <w:proofErr w:type="spellStart"/>
-            <w:r>
-              <w:t>Xanrus</w:t>
-            </w:r>
-            <w:proofErr w:type="spellEnd"/>
-            <w:r>
-              <w:t xml:space="preserve"> heals for 1d4 + </w:t>
+              <w:t xml:space="preserve"> Lord Xanrus heals for 1d4 + </w:t>
             </w:r>
             <w:r>
               <w:rPr>
@@ -19243,10 +19106,7 @@
               <w:jc w:val="center"/>
             </w:pPr>
             <w:r>
-              <w:t>1</w:t>
-            </w:r>
-            <w:r>
-              <w:t>3</w:t>
+              <w:t>13</w:t>
             </w:r>
           </w:p>
         </w:tc>
@@ -19314,10 +19174,7 @@
               <w:jc w:val="center"/>
             </w:pPr>
             <w:r>
-              <w:t>+</w:t>
-            </w:r>
-            <w:r>
-              <w:t>1</w:t>
+              <w:t>+1</w:t>
             </w:r>
           </w:p>
         </w:tc>
@@ -19475,10 +19332,7 @@
               <w:jc w:val="center"/>
             </w:pPr>
             <w:r>
-              <w:t>+</w:t>
-            </w:r>
-            <w:r>
-              <w:t>2</w:t>
+              <w:t>+2</w:t>
             </w:r>
           </w:p>
         </w:tc>
@@ -19572,10 +19426,7 @@
               <w:jc w:val="center"/>
             </w:pPr>
             <w:r>
-              <w:t>+</w:t>
-            </w:r>
-            <w:r>
-              <w:t>2</w:t>
+              <w:t>+2</w:t>
             </w:r>
           </w:p>
         </w:tc>
@@ -20594,13 +20445,7 @@
               </w:rPr>
             </w:pPr>
             <w:r>
-              <w:t xml:space="preserve">This spell may be cast while out of combat, but it ends </w:t>
-            </w:r>
-            <w:r>
-              <w:t xml:space="preserve">Taia’s </w:t>
-            </w:r>
-            <w:r>
-              <w:t>turn.</w:t>
+              <w:t>This spell may be cast while out of combat, but it ends Taia’s turn.</w:t>
             </w:r>
           </w:p>
         </w:tc>
@@ -20839,7 +20684,7 @@
                 <w:noProof/>
               </w:rPr>
               <w:drawing>
-                <wp:inline distT="0" distB="0" distL="0" distR="0" wp14:anchorId="165D800C" wp14:editId="3F09895A">
+                <wp:inline distT="0" distB="0" distL="0" distR="0" wp14:anchorId="165D800C" wp14:editId="2CB2F862">
                   <wp:extent cx="1326287" cy="1771211"/>
                   <wp:effectExtent l="0" t="0" r="0" b="635"/>
                   <wp:docPr id="61273789" name="Image 2"/>
@@ -20991,10 +20836,7 @@
               <w:jc w:val="center"/>
             </w:pPr>
             <w:r>
-              <w:t>1</w:t>
-            </w:r>
-            <w:r>
-              <w:t>1</w:t>
+              <w:t>11</w:t>
             </w:r>
           </w:p>
         </w:tc>
@@ -22077,10 +21919,7 @@
               <w:jc w:val="center"/>
             </w:pPr>
             <w:r>
-              <w:t>d</w:t>
-            </w:r>
-            <w:r>
-              <w:t>8</w:t>
+              <w:t>d8</w:t>
             </w:r>
           </w:p>
         </w:tc>
@@ -22116,10 +21955,7 @@
               <w:jc w:val="center"/>
             </w:pPr>
             <w:r>
-              <w:t>1</w:t>
-            </w:r>
-            <w:r>
-              <w:t>0</w:t>
+              <w:t>10</w:t>
             </w:r>
           </w:p>
         </w:tc>
@@ -22345,10 +22181,7 @@
               <w:jc w:val="center"/>
             </w:pPr>
             <w:r>
-              <w:t>+</w:t>
-            </w:r>
-            <w:r>
-              <w:t>2</w:t>
+              <w:t>+2</w:t>
             </w:r>
           </w:p>
         </w:tc>
@@ -22442,10 +22275,7 @@
               <w:jc w:val="center"/>
             </w:pPr>
             <w:r>
-              <w:t>+</w:t>
-            </w:r>
-            <w:r>
-              <w:t>1</w:t>
+              <w:t>+1</w:t>
             </w:r>
           </w:p>
         </w:tc>
@@ -22700,13 +22530,7 @@
           </w:tcPr>
           <w:p>
             <w:r>
-              <w:t xml:space="preserve">Hannah can store Daggers in the scroll slots. Each adds 1d4 damage to her </w:t>
-            </w:r>
-            <w:r>
-              <w:t>Base</w:t>
-            </w:r>
-            <w:r>
-              <w:t xml:space="preserve"> attack and isn’t consumed upon use</w:t>
+              <w:t>Hannah can store Daggers in the scroll slots. Each adds 1d4 damage to her Base attack and isn’t consumed upon use</w:t>
             </w:r>
             <w:r>
               <w:t>.</w:t>
@@ -23027,13 +22851,7 @@
           </w:tcPr>
           <w:p>
             <w:r>
-              <w:t>Hannah prepares a cunning strike. On her next turn</w:t>
-            </w:r>
-            <w:r>
-              <w:t>,</w:t>
-            </w:r>
-            <w:r>
-              <w:t xml:space="preserve"> she can act before and after the Monster.</w:t>
+              <w:t>Hannah prepares a cunning strike. On her next turn, she can act before and after the Monster.</w:t>
             </w:r>
           </w:p>
           <w:p>
@@ -23283,10 +23101,7 @@
               <w:jc w:val="center"/>
             </w:pPr>
             <w:r>
-              <w:t>1</w:t>
-            </w:r>
-            <w:r>
-              <w:t>2</w:t>
+              <w:t>12</w:t>
             </w:r>
           </w:p>
         </w:tc>
@@ -23354,10 +23169,7 @@
               <w:jc w:val="center"/>
             </w:pPr>
             <w:r>
-              <w:t>+</w:t>
-            </w:r>
-            <w:r>
-              <w:t>2</w:t>
+              <w:t>+2</w:t>
             </w:r>
           </w:p>
         </w:tc>
@@ -23516,10 +23328,7 @@
               <w:jc w:val="center"/>
             </w:pPr>
             <w:r>
-              <w:t>+</w:t>
-            </w:r>
-            <w:r>
-              <w:t>3</w:t>
+              <w:t>+3</w:t>
             </w:r>
           </w:p>
         </w:tc>
@@ -23742,13 +23551,7 @@
           </w:tcPr>
           <w:p>
             <w:r>
-              <w:t xml:space="preserve">Kirima always goes first </w:t>
-            </w:r>
-            <w:r>
-              <w:t>i</w:t>
-            </w:r>
-            <w:r>
-              <w:t>n Initiative order.</w:t>
+              <w:t>Kirima always goes first in Initiative order.</w:t>
             </w:r>
           </w:p>
         </w:tc>
@@ -24187,6 +23990,12 @@
             <w:vAlign w:val="center"/>
           </w:tcPr>
           <w:p>
+            <w:pPr>
+              <w:rPr>
+                <w:b/>
+                <w:bCs/>
+              </w:rPr>
+            </w:pPr>
             <w:r>
               <w:t>Kirima has a different Combat Feature depending on the kind of Monster she is fighting.</w:t>
             </w:r>
@@ -24467,12 +24276,10 @@
         <w:pStyle w:val="Titre2"/>
       </w:pPr>
       <w:bookmarkStart w:id="35" w:name="_Toc242108217"/>
-      <w:proofErr w:type="spellStart"/>
       <w:r>
         <w:lastRenderedPageBreak/>
         <w:t>Valduk</w:t>
       </w:r>
-      <w:proofErr w:type="spellEnd"/>
       <w:r>
         <w:t xml:space="preserve">, </w:t>
       </w:r>
@@ -25145,13 +24952,8 @@
             <w:vAlign w:val="center"/>
           </w:tcPr>
           <w:p>
-            <w:proofErr w:type="spellStart"/>
-            <w:r>
-              <w:t>Valduk’s</w:t>
-            </w:r>
-            <w:proofErr w:type="spellEnd"/>
-            <w:r>
-              <w:t xml:space="preserve"> </w:t>
+            <w:r>
+              <w:t xml:space="preserve">Valduk’s </w:t>
             </w:r>
             <w:r>
               <w:rPr>
@@ -25286,13 +25088,8 @@
             <w:vAlign w:val="center"/>
           </w:tcPr>
           <w:p>
-            <w:proofErr w:type="spellStart"/>
-            <w:r>
-              <w:t>Valduk</w:t>
-            </w:r>
-            <w:proofErr w:type="spellEnd"/>
-            <w:r>
-              <w:t xml:space="preserve"> can grant himself advantage on his attacks for </w:t>
+            <w:r>
+              <w:t xml:space="preserve">Valduk can grant himself advantage on his attacks for </w:t>
             </w:r>
             <w:r>
               <w:t>1</w:t>
@@ -25426,15 +25223,7 @@
           </w:tcPr>
           <w:p>
             <w:r>
-              <w:t xml:space="preserve">If he doesn’t collect the loot after combat is over, </w:t>
-            </w:r>
-            <w:proofErr w:type="spellStart"/>
-            <w:r>
-              <w:t>Valduk</w:t>
-            </w:r>
-            <w:proofErr w:type="spellEnd"/>
-            <w:r>
-              <w:t xml:space="preserve"> can continue his turn</w:t>
+              <w:t>If he doesn’t collect the loot after combat is over, Valduk can continue his turn</w:t>
             </w:r>
             <w:r>
               <w:t>.</w:t>
@@ -25572,22 +25361,15 @@
             <w:vAlign w:val="center"/>
           </w:tcPr>
           <w:p>
-            <w:proofErr w:type="spellStart"/>
+            <w:r>
+              <w:t xml:space="preserve">Valduk enters a rage. </w:t>
+            </w:r>
+            <w:r>
+              <w:t xml:space="preserve">For the next two turns </w:t>
+            </w:r>
             <w:r>
               <w:t>Valduk</w:t>
             </w:r>
-            <w:proofErr w:type="spellEnd"/>
-            <w:r>
-              <w:t xml:space="preserve"> enters a rage. </w:t>
-            </w:r>
-            <w:r>
-              <w:t xml:space="preserve">For the next two turns </w:t>
-            </w:r>
-            <w:proofErr w:type="spellStart"/>
-            <w:r>
-              <w:t>Valduk</w:t>
-            </w:r>
-            <w:proofErr w:type="spellEnd"/>
             <w:r>
               <w:t xml:space="preserve"> is resistant to </w:t>
             </w:r>
@@ -25597,11 +25379,9 @@
             <w:r>
               <w:t xml:space="preserve">hysical damage, and he </w:t>
             </w:r>
-            <w:proofErr w:type="spellStart"/>
             <w:r>
               <w:t>recieves</w:t>
             </w:r>
-            <w:proofErr w:type="spellEnd"/>
             <w:r>
               <w:t xml:space="preserve"> +1 to his </w:t>
             </w:r>
@@ -25933,10 +25713,7 @@
               <w:jc w:val="center"/>
             </w:pPr>
             <w:r>
-              <w:t>+</w:t>
-            </w:r>
-            <w:r>
-              <w:t>1</w:t>
+              <w:t>+1</w:t>
             </w:r>
           </w:p>
         </w:tc>
@@ -26094,10 +25871,7 @@
               <w:jc w:val="center"/>
             </w:pPr>
             <w:r>
-              <w:t>+</w:t>
-            </w:r>
-            <w:r>
-              <w:t>2</w:t>
+              <w:t>+2</w:t>
             </w:r>
           </w:p>
         </w:tc>
@@ -26191,10 +25965,7 @@
               <w:jc w:val="center"/>
             </w:pPr>
             <w:r>
-              <w:t>+</w:t>
-            </w:r>
-            <w:r>
-              <w:t>2</w:t>
+              <w:t>+2</w:t>
             </w:r>
           </w:p>
         </w:tc>
@@ -26322,15 +26093,7 @@
           </w:tcPr>
           <w:p>
             <w:r>
-              <w:t xml:space="preserve">Baron </w:t>
-            </w:r>
-            <w:proofErr w:type="spellStart"/>
-            <w:r>
-              <w:t>Markul</w:t>
-            </w:r>
-            <w:proofErr w:type="spellEnd"/>
-            <w:r>
-              <w:t xml:space="preserve"> can cast </w:t>
+              <w:t xml:space="preserve">Baron Markul can cast </w:t>
             </w:r>
             <w:r>
               <w:t xml:space="preserve">the </w:t>
@@ -26342,13 +26105,7 @@
               <w:t xml:space="preserve"> spell</w:t>
             </w:r>
             <w:r>
-              <w:t xml:space="preserve"> without expending a </w:t>
-            </w:r>
-            <w:r>
-              <w:t>S</w:t>
-            </w:r>
-            <w:r>
-              <w:t>pell slot</w:t>
+              <w:t xml:space="preserve"> without expending a Spell slot</w:t>
             </w:r>
             <w:r>
               <w:t xml:space="preserve">, and </w:t>
@@ -26491,15 +26248,7 @@
               <w:jc w:val="left"/>
             </w:pPr>
             <w:r>
-              <w:t xml:space="preserve">Baron </w:t>
-            </w:r>
-            <w:proofErr w:type="spellStart"/>
-            <w:r>
-              <w:t>Markul’s</w:t>
-            </w:r>
-            <w:proofErr w:type="spellEnd"/>
-            <w:r>
-              <w:t xml:space="preserve"> Swords in the main Slot grant an additional +1 to his </w:t>
+              <w:t xml:space="preserve">Baron Markul’s Swords in the main Slot grant an additional +1 to his </w:t>
             </w:r>
             <w:r>
               <w:rPr>
@@ -26650,13 +26399,8 @@
               <w:t>At the start of his turn</w:t>
             </w:r>
             <w:r>
-              <w:t xml:space="preserve">, Baron </w:t>
-            </w:r>
-            <w:proofErr w:type="spellStart"/>
-            <w:r>
-              <w:t>Markul</w:t>
-            </w:r>
-            <w:proofErr w:type="spellEnd"/>
+              <w:t>, Baron Markul</w:t>
+            </w:r>
             <w:r>
               <w:t xml:space="preserve"> can </w:t>
             </w:r>
@@ -26858,26 +26602,16 @@
           </w:tcPr>
           <w:p>
             <w:r>
-              <w:t xml:space="preserve">Baron </w:t>
-            </w:r>
-            <w:proofErr w:type="spellStart"/>
-            <w:r>
-              <w:t>Markul</w:t>
-            </w:r>
-            <w:proofErr w:type="spellEnd"/>
+              <w:t>Baron Markul</w:t>
+            </w:r>
             <w:r>
               <w:t xml:space="preserve"> can cast a single spell in its turn instead of using the Base Attack.</w:t>
             </w:r>
           </w:p>
           <w:p>
             <w:r>
-              <w:t xml:space="preserve">Baron </w:t>
-            </w:r>
-            <w:proofErr w:type="spellStart"/>
-            <w:r>
-              <w:t>Markul</w:t>
-            </w:r>
-            <w:proofErr w:type="spellEnd"/>
+              <w:t>Baron Markul</w:t>
+            </w:r>
             <w:r>
               <w:t xml:space="preserve"> can cast Cantrips without limit, but only has two Spell Slots for Levelled Spells. </w:t>
             </w:r>
@@ -26955,13 +26689,8 @@
           </w:tcPr>
           <w:p>
             <w:r>
-              <w:t xml:space="preserve">Baron </w:t>
-            </w:r>
-            <w:proofErr w:type="spellStart"/>
-            <w:r>
-              <w:t>Markul</w:t>
-            </w:r>
-            <w:proofErr w:type="spellEnd"/>
+              <w:t>Baron Markul</w:t>
+            </w:r>
             <w:r>
               <w:t xml:space="preserve"> gains resistance against Physical damage until his next turn.</w:t>
             </w:r>
@@ -27101,15 +26830,7 @@
           </w:tcPr>
           <w:p>
             <w:r>
-              <w:t xml:space="preserve">Baron </w:t>
-            </w:r>
-            <w:proofErr w:type="spellStart"/>
-            <w:r>
-              <w:t>Markul</w:t>
-            </w:r>
-            <w:proofErr w:type="spellEnd"/>
-            <w:r>
-              <w:t xml:space="preserve"> gains +2 AC until the end of combat.</w:t>
+              <w:t>Baron Markul gains +2 AC until the end of combat.</w:t>
             </w:r>
           </w:p>
         </w:tc>
@@ -27171,13 +26892,8 @@
               <w:t>Up-cast:</w:t>
             </w:r>
             <w:r>
-              <w:t xml:space="preserve"> In addition to the AC bonus, Baron </w:t>
-            </w:r>
-            <w:proofErr w:type="spellStart"/>
-            <w:r>
-              <w:t>Markul</w:t>
-            </w:r>
-            <w:proofErr w:type="spellEnd"/>
+              <w:t xml:space="preserve"> In addition to the AC bonus, Baron Markul</w:t>
+            </w:r>
             <w:r>
               <w:t xml:space="preserve"> heals for 1d6+ </w:t>
             </w:r>
@@ -27255,15 +26971,7 @@
           </w:p>
           <w:p>
             <w:r>
-              <w:t xml:space="preserve">Baron </w:t>
-            </w:r>
-            <w:proofErr w:type="spellStart"/>
-            <w:r>
-              <w:t>Markul</w:t>
-            </w:r>
-            <w:proofErr w:type="spellEnd"/>
-            <w:r>
-              <w:t xml:space="preserve"> adds 1d8 Fire damage to the result of that attack.</w:t>
+              <w:t>Baron Markul adds 1d8 Fire damage to the result of that attack.</w:t>
             </w:r>
           </w:p>
         </w:tc>
@@ -27644,10 +27352,7 @@
               <w:jc w:val="center"/>
             </w:pPr>
             <w:r>
-              <w:t>+</w:t>
-            </w:r>
-            <w:r>
-              <w:t>1</w:t>
+              <w:t>+1</w:t>
             </w:r>
           </w:p>
         </w:tc>
@@ -27805,10 +27510,7 @@
               <w:jc w:val="center"/>
             </w:pPr>
             <w:r>
-              <w:t>+</w:t>
-            </w:r>
-            <w:r>
-              <w:t>2</w:t>
+              <w:t>+2</w:t>
             </w:r>
           </w:p>
         </w:tc>
@@ -28168,19 +27870,7 @@
           </w:tcPr>
           <w:p>
             <w:r>
-              <w:t>Doctor Sidhar can expend 1 Spell Slot during combat to</w:t>
-            </w:r>
-            <w:r>
-              <w:t xml:space="preserve"> conjure a</w:t>
-            </w:r>
-            <w:r>
-              <w:t>n Eldritch Cannon</w:t>
-            </w:r>
-            <w:r>
-              <w:t xml:space="preserve"> Familiar from the list at the end of the rulebook.</w:t>
-            </w:r>
-            <w:r>
-              <w:t xml:space="preserve"> It takes one of three forms by the player’s choice.</w:t>
+              <w:t>Doctor Sidhar can expend 1 Spell Slot during combat to conjure an Eldritch Cannon Familiar from the list at the end of the rulebook. It takes one of three forms by the player’s choice.</w:t>
             </w:r>
           </w:p>
           <w:p>
@@ -28529,13 +28219,7 @@
               <w:t>Doctor Sidhar</w:t>
             </w:r>
             <w:r>
-              <w:t xml:space="preserve"> can cast Cantrips without limit, but only has two </w:t>
-            </w:r>
-            <w:r>
-              <w:t>Spell slot</w:t>
-            </w:r>
-            <w:r>
-              <w:t xml:space="preserve">s for Levelled Spells. </w:t>
+              <w:t xml:space="preserve"> can cast Cantrips without limit, but only has two Spell slots for Levelled Spells. </w:t>
             </w:r>
             <w:r>
               <w:t>He</w:t>
@@ -29082,7 +28766,7 @@
                 <w:noProof/>
               </w:rPr>
               <w:drawing>
-                <wp:inline distT="0" distB="0" distL="0" distR="0" wp14:anchorId="4CB876C7" wp14:editId="3674D050">
+                <wp:inline distT="0" distB="0" distL="0" distR="0" wp14:anchorId="4CB876C7" wp14:editId="17BE6BDB">
                   <wp:extent cx="1326287" cy="1771211"/>
                   <wp:effectExtent l="0" t="0" r="7620" b="635"/>
                   <wp:docPr id="418584972" name="Image 2"/>
@@ -29457,10 +29141,7 @@
               <w:jc w:val="center"/>
             </w:pPr>
             <w:r>
-              <w:t>+</w:t>
-            </w:r>
-            <w:r>
-              <w:t>2</w:t>
+              <w:t>+2</w:t>
             </w:r>
           </w:p>
         </w:tc>
@@ -29554,10 +29235,7 @@
               <w:jc w:val="center"/>
             </w:pPr>
             <w:r>
-              <w:t>+</w:t>
-            </w:r>
-            <w:r>
-              <w:t>2</w:t>
+              <w:t>+2</w:t>
             </w:r>
           </w:p>
         </w:tc>
@@ -29817,16 +29495,7 @@
           </w:tcPr>
           <w:p>
             <w:r>
-              <w:t xml:space="preserve">When Lady Lorrain </w:t>
-            </w:r>
-            <w:r>
-              <w:t xml:space="preserve">or her allies </w:t>
-            </w:r>
-            <w:r>
-              <w:t xml:space="preserve">roll a 1 on </w:t>
-            </w:r>
-            <w:r>
-              <w:t xml:space="preserve">a </w:t>
+              <w:t xml:space="preserve">When Lady Lorrain or her allies roll a 1 on a </w:t>
             </w:r>
             <w:r>
               <w:rPr>
@@ -30171,13 +29840,7 @@
               <w:t>Lady Lorraine</w:t>
             </w:r>
             <w:r>
-              <w:t xml:space="preserve"> can cast Cantrips without limit, but only has two </w:t>
-            </w:r>
-            <w:r>
-              <w:t>Spell slot</w:t>
-            </w:r>
-            <w:r>
-              <w:t xml:space="preserve">s for Levelled Spells. </w:t>
+              <w:t xml:space="preserve"> can cast Cantrips without limit, but only has two Spell slots for Levelled Spells. </w:t>
             </w:r>
             <w:r>
               <w:t>She</w:t>
@@ -30321,13 +29984,8 @@
           </w:tcPr>
           <w:p>
             <w:r>
-              <w:t xml:space="preserve">Baron </w:t>
-            </w:r>
-            <w:proofErr w:type="spellStart"/>
-            <w:r>
-              <w:t>Markul</w:t>
-            </w:r>
-            <w:proofErr w:type="spellEnd"/>
+              <w:t>Baron Markul</w:t>
+            </w:r>
             <w:r>
               <w:t xml:space="preserve"> gains resistance against Physical damage until his next turn.</w:t>
             </w:r>
@@ -30390,10 +30048,7 @@
           </w:tcPr>
           <w:p>
             <w:r>
-              <w:t>Lady Lorraine</w:t>
-            </w:r>
-            <w:r>
-              <w:t xml:space="preserve"> conjures a Familiar from the list at the end of the rulebook.</w:t>
+              <w:t>Lady Lorraine conjures a Familiar from the list at the end of the rulebook.</w:t>
             </w:r>
           </w:p>
           <w:p>
@@ -30476,13 +30131,7 @@
               </w:rPr>
             </w:pPr>
             <w:r>
-              <w:t xml:space="preserve">This spell may be cast while out of combat, but it ends </w:t>
-            </w:r>
-            <w:r>
-              <w:t>Lady Lorraine’</w:t>
-            </w:r>
-            <w:r>
-              <w:t xml:space="preserve"> turn.</w:t>
+              <w:t>This spell may be cast while out of combat, but it ends Lady Lorraine’ turn.</w:t>
             </w:r>
           </w:p>
         </w:tc>
@@ -32989,10 +32638,7 @@
               <w:t xml:space="preserve"> </w:t>
             </w:r>
             <w:r>
-              <w:t xml:space="preserve">Temporary HP </w:t>
-            </w:r>
-            <w:r>
-              <w:t>cannot be healed.</w:t>
+              <w:t>Temporary HP cannot be healed.</w:t>
             </w:r>
           </w:p>
           <w:p>
@@ -35274,6 +34920,7 @@
   <w:style w:type="character" w:default="1" w:styleId="Policepardfaut">
     <w:name w:val="Default Paragraph Font"/>
     <w:uiPriority w:val="1"/>
+    <w:semiHidden/>
     <w:unhideWhenUsed/>
   </w:style>
   <w:style w:type="table" w:default="1" w:styleId="TableauNormal">

</xml_diff>